<commit_message>
sidebar completed and some part of feed
</commit_message>
<xml_diff>
--- a/roadmap.docx
+++ b/roadmap.docx
@@ -139,7 +139,15 @@
         </w:numPr>
       </w:pPr>
       <w:r>
-        <w:t xml:space="preserve">Now create a pages folder inside the </w:t>
+        <w:t xml:space="preserve">Now create a </w:t>
+      </w:r>
+      <w:proofErr w:type="gramStart"/>
+      <w:r>
+        <w:t>pages</w:t>
+      </w:r>
+      <w:proofErr w:type="gramEnd"/>
+      <w:r>
+        <w:t xml:space="preserve"> folder inside the </w:t>
       </w:r>
       <w:proofErr w:type="spellStart"/>
       <w:r>
@@ -155,12 +163,445 @@
       </w:r>
       <w:proofErr w:type="spellEnd"/>
       <w:r>
-        <w:t xml:space="preserve"> and sty</w:t>
+        <w:t xml:space="preserve"> and style files</w:t>
+      </w:r>
+    </w:p>
+    <w:p>
+      <w:pPr>
+        <w:pStyle w:val="ListParagraph"/>
+        <w:numPr>
+          <w:ilvl w:val="0"/>
+          <w:numId w:val="1"/>
+        </w:numPr>
+      </w:pPr>
+      <w:r>
+        <w:t>Now install material icons in the project</w:t>
+      </w:r>
+      <w:r>
+        <w:t xml:space="preserve"> from the website in it use two </w:t>
+      </w:r>
+      <w:proofErr w:type="spellStart"/>
+      <w:r>
+        <w:t>npm</w:t>
+      </w:r>
+      <w:proofErr w:type="spellEnd"/>
+      <w:r>
+        <w:t xml:space="preserve"> install commands first for default installation and second for icon installation and then check the installation by importing any icon </w:t>
+      </w:r>
+      <w:proofErr w:type="spellStart"/>
+      <w:r>
+        <w:t>eg</w:t>
+      </w:r>
+      <w:proofErr w:type="spellEnd"/>
+      <w:r>
+        <w:t xml:space="preserve"> person and using it in the app.js and check that it appears on the screen</w:t>
+      </w:r>
+    </w:p>
+    <w:p>
+      <w:pPr>
+        <w:pStyle w:val="ListParagraph"/>
+        <w:numPr>
+          <w:ilvl w:val="0"/>
+          <w:numId w:val="1"/>
+        </w:numPr>
+      </w:pPr>
+      <w:r>
+        <w:t xml:space="preserve">Now create the first component in the components folder called </w:t>
+      </w:r>
+      <w:proofErr w:type="spellStart"/>
+      <w:r>
+        <w:t>topbar</w:t>
+      </w:r>
+      <w:proofErr w:type="spellEnd"/>
+      <w:r>
+        <w:t xml:space="preserve"> by creating a folder and files in it and import it in home.js page</w:t>
+      </w:r>
+    </w:p>
+    <w:p>
+      <w:pPr>
+        <w:pStyle w:val="ListParagraph"/>
+        <w:numPr>
+          <w:ilvl w:val="0"/>
+          <w:numId w:val="1"/>
+        </w:numPr>
+      </w:pPr>
+      <w:r>
+        <w:t xml:space="preserve"> </w:t>
+      </w:r>
+      <w:r>
+        <w:t xml:space="preserve">Now create the </w:t>
+      </w:r>
+      <w:proofErr w:type="spellStart"/>
+      <w:r>
+        <w:t>topbar</w:t>
+      </w:r>
+      <w:proofErr w:type="spellEnd"/>
+      <w:r>
+        <w:t xml:space="preserve"> component by dividing the whole bar into 3 </w:t>
+      </w:r>
+      <w:proofErr w:type="spellStart"/>
+      <w:r>
+        <w:t>divs</w:t>
+      </w:r>
+      <w:proofErr w:type="spellEnd"/>
+      <w:r>
+        <w:t xml:space="preserve"> right, center and left</w:t>
+      </w:r>
+    </w:p>
+    <w:p>
+      <w:pPr>
+        <w:pStyle w:val="ListParagraph"/>
+        <w:numPr>
+          <w:ilvl w:val="0"/>
+          <w:numId w:val="1"/>
+        </w:numPr>
+      </w:pPr>
+      <w:r>
+        <w:t>In the left div there will be a span containing the logo, in the center there will be the search material icon</w:t>
+      </w:r>
+      <w:r>
+        <w:t xml:space="preserve"> imported from material icons and an input containing a placeholder and in the right a div of </w:t>
+      </w:r>
+      <w:proofErr w:type="spellStart"/>
+      <w:r>
+        <w:t>topbarLinks</w:t>
+      </w:r>
+      <w:proofErr w:type="spellEnd"/>
+      <w:r>
+        <w:t xml:space="preserve"> containing two spans i.e. two links to homepage and timeline and after this div another div of </w:t>
+      </w:r>
+      <w:proofErr w:type="spellStart"/>
+      <w:r>
+        <w:t>topbarIcons</w:t>
+      </w:r>
+      <w:proofErr w:type="spellEnd"/>
+      <w:r>
+        <w:t xml:space="preserve"> in which a div of </w:t>
+      </w:r>
+      <w:proofErr w:type="spellStart"/>
+      <w:r>
+        <w:t>topbarIconItem</w:t>
+      </w:r>
+      <w:proofErr w:type="spellEnd"/>
+      <w:r>
+        <w:t xml:space="preserve"> containing a material icon of person and a span which will be used as a badge</w:t>
+      </w:r>
+      <w:r>
+        <w:t xml:space="preserve">, add two more </w:t>
+      </w:r>
+      <w:proofErr w:type="spellStart"/>
+      <w:r>
+        <w:t>topbarIconItem</w:t>
+      </w:r>
+      <w:proofErr w:type="spellEnd"/>
+      <w:r>
+        <w:t xml:space="preserve"> called Chat and Notifications </w:t>
+      </w:r>
+      <w:r>
+        <w:t xml:space="preserve">and after this icons div an </w:t>
+      </w:r>
+      <w:proofErr w:type="spellStart"/>
+      <w:r>
+        <w:t>img</w:t>
+      </w:r>
+      <w:proofErr w:type="spellEnd"/>
+      <w:r>
+        <w:t xml:space="preserve"> which will be used as profile pic</w:t>
+      </w:r>
+    </w:p>
+    <w:p>
+      <w:pPr>
+        <w:pStyle w:val="ListParagraph"/>
+        <w:numPr>
+          <w:ilvl w:val="0"/>
+          <w:numId w:val="1"/>
+        </w:numPr>
+      </w:pPr>
+      <w:r>
+        <w:t xml:space="preserve">Now give styling to the </w:t>
+      </w:r>
+      <w:proofErr w:type="spellStart"/>
+      <w:r>
+        <w:t>topbar</w:t>
+      </w:r>
+      <w:proofErr w:type="spellEnd"/>
+    </w:p>
+    <w:p>
+      <w:pPr>
+        <w:pStyle w:val="ListParagraph"/>
+        <w:numPr>
+          <w:ilvl w:val="0"/>
+          <w:numId w:val="1"/>
+        </w:numPr>
+      </w:pPr>
+      <w:r>
+        <w:t xml:space="preserve">Now create 3 component folders namely sidebar, feed, </w:t>
+      </w:r>
+      <w:proofErr w:type="spellStart"/>
+      <w:r>
+        <w:t>rightbar</w:t>
+      </w:r>
+      <w:proofErr w:type="spellEnd"/>
+      <w:r>
+        <w:t xml:space="preserve"> and the related </w:t>
+      </w:r>
+      <w:proofErr w:type="spellStart"/>
+      <w:r>
+        <w:t>jsx</w:t>
+      </w:r>
+      <w:proofErr w:type="spellEnd"/>
+      <w:r>
+        <w:t xml:space="preserve"> and </w:t>
+      </w:r>
+      <w:proofErr w:type="spellStart"/>
+      <w:r>
+        <w:t>css</w:t>
+      </w:r>
+      <w:proofErr w:type="spellEnd"/>
+      <w:r>
+        <w:t xml:space="preserve"> files and create the components in it</w:t>
+      </w:r>
+      <w:r>
+        <w:t xml:space="preserve"> and then import these components in the </w:t>
+      </w:r>
+      <w:proofErr w:type="spellStart"/>
+      <w:r>
+        <w:t>home.jsx</w:t>
+      </w:r>
+      <w:proofErr w:type="spellEnd"/>
+      <w:r>
+        <w:t xml:space="preserve"> page inside a div</w:t>
+      </w:r>
+      <w:r>
+        <w:t xml:space="preserve"> and assign them their widths using flex</w:t>
+      </w:r>
+    </w:p>
+    <w:p>
+      <w:pPr>
+        <w:pStyle w:val="ListParagraph"/>
+        <w:numPr>
+          <w:ilvl w:val="0"/>
+          <w:numId w:val="1"/>
+        </w:numPr>
+      </w:pPr>
+      <w:r>
+        <w:t xml:space="preserve">Now first edit the sidebar first create a wrapper div inside the sidebar and give it padding and background color then create a </w:t>
+      </w:r>
+      <w:proofErr w:type="spellStart"/>
+      <w:r>
+        <w:t>ul</w:t>
+      </w:r>
+      <w:proofErr w:type="spellEnd"/>
+      <w:r>
+        <w:t xml:space="preserve"> in which add items which are material </w:t>
+      </w:r>
+      <w:proofErr w:type="spellStart"/>
+      <w:r>
+        <w:t>ui</w:t>
+      </w:r>
+      <w:proofErr w:type="spellEnd"/>
+      <w:r>
+        <w:t xml:space="preserve"> icons and the spans containing their text</w:t>
+      </w:r>
+      <w:r>
+        <w:t xml:space="preserve"> below the </w:t>
+      </w:r>
+      <w:proofErr w:type="spellStart"/>
+      <w:r>
+        <w:t>ul</w:t>
+      </w:r>
+      <w:proofErr w:type="spellEnd"/>
+      <w:r>
+        <w:t xml:space="preserve"> add a button of show more and below it a horizontal rule and below it another </w:t>
+      </w:r>
+      <w:proofErr w:type="spellStart"/>
+      <w:r>
+        <w:t>ul</w:t>
+      </w:r>
+      <w:proofErr w:type="spellEnd"/>
+      <w:r>
+        <w:t xml:space="preserve"> which contains the friends items with each li containing the friend image and friend username</w:t>
+      </w:r>
+      <w:r>
+        <w:t xml:space="preserve"> add 8 to 9 friends and set the overflow to scroll for this sidebar</w:t>
+      </w:r>
+      <w:r>
+        <w:t xml:space="preserve"> and to style the scrollbar use ::-</w:t>
+      </w:r>
+      <w:proofErr w:type="spellStart"/>
+      <w:r>
+        <w:t>webkit</w:t>
+      </w:r>
+      <w:proofErr w:type="spellEnd"/>
+      <w:r>
+        <w:t xml:space="preserve">-scrollbar, track, thumb properties in </w:t>
+      </w:r>
+      <w:proofErr w:type="spellStart"/>
+      <w:r>
+        <w:t>css</w:t>
+      </w:r>
+      <w:proofErr w:type="spellEnd"/>
+    </w:p>
+    <w:p>
+      <w:pPr>
+        <w:pStyle w:val="ListParagraph"/>
+        <w:numPr>
+          <w:ilvl w:val="0"/>
+          <w:numId w:val="1"/>
+        </w:numPr>
+      </w:pPr>
+      <w:r>
+        <w:t xml:space="preserve">Now moving to the feed part create a wrapper div just like the sidebar and in it instead of direct writing create components first a share component which contains a share container and a wrapper div and in the wrapper two more </w:t>
+      </w:r>
+      <w:proofErr w:type="spellStart"/>
+      <w:r>
+        <w:t>divs</w:t>
+      </w:r>
+      <w:proofErr w:type="spellEnd"/>
+      <w:r>
+        <w:t xml:space="preserve"> namely </w:t>
+      </w:r>
+      <w:proofErr w:type="spellStart"/>
+      <w:r>
+        <w:t>shareTop</w:t>
+      </w:r>
+      <w:proofErr w:type="spellEnd"/>
+      <w:r>
+        <w:t xml:space="preserve"> and </w:t>
+      </w:r>
+      <w:proofErr w:type="spellStart"/>
+      <w:r>
+        <w:t>shareBottom</w:t>
+      </w:r>
+      <w:proofErr w:type="spellEnd"/>
+      <w:r>
+        <w:t xml:space="preserve"> separated by a horizontal rule, the top will contain an image which is the profile pic and an input. The bottom will contain a div namely </w:t>
+      </w:r>
+      <w:proofErr w:type="spellStart"/>
+      <w:r>
+        <w:t>shareOp</w:t>
+      </w:r>
+      <w:r>
+        <w:t>tions</w:t>
+      </w:r>
+      <w:proofErr w:type="spellEnd"/>
+      <w:r>
+        <w:t xml:space="preserve"> which also contains a div called </w:t>
+      </w:r>
+      <w:proofErr w:type="spellStart"/>
+      <w:r>
+        <w:t>shareOption</w:t>
+      </w:r>
+      <w:proofErr w:type="spellEnd"/>
+      <w:r>
+        <w:t xml:space="preserve"> which contains a material icon of </w:t>
+      </w:r>
+      <w:proofErr w:type="spellStart"/>
+      <w:r>
+        <w:t>PermMedia</w:t>
+      </w:r>
+      <w:proofErr w:type="spellEnd"/>
+      <w:r>
+        <w:t xml:space="preserve"> and a span having Photo/Video written in it</w:t>
+      </w:r>
+      <w:r>
+        <w:t xml:space="preserve"> copy four </w:t>
+      </w:r>
+      <w:proofErr w:type="spellStart"/>
+      <w:r>
+        <w:t>shareOption</w:t>
+      </w:r>
+      <w:proofErr w:type="spellEnd"/>
+      <w:r>
+        <w:t xml:space="preserve"> </w:t>
+      </w:r>
+      <w:proofErr w:type="spellStart"/>
+      <w:r>
+        <w:t>divs</w:t>
+      </w:r>
+      <w:r>
+        <w:t>.</w:t>
+      </w:r>
+      <w:proofErr w:type="spellEnd"/>
+    </w:p>
+    <w:p>
+      <w:pPr>
+        <w:pStyle w:val="ListParagraph"/>
+        <w:numPr>
+          <w:ilvl w:val="0"/>
+          <w:numId w:val="1"/>
+        </w:numPr>
+      </w:pPr>
+      <w:r>
+        <w:t xml:space="preserve">Now style the share container by giving it border radius and a box shadow can check from </w:t>
+      </w:r>
+      <w:proofErr w:type="spellStart"/>
+      <w:r>
+        <w:t>css</w:t>
+      </w:r>
+      <w:proofErr w:type="spellEnd"/>
+      <w:r>
+        <w:t xml:space="preserve"> box shadow generator online</w:t>
+      </w:r>
+      <w:r>
+        <w:t xml:space="preserve"> then style the profile pic, input and the </w:t>
+      </w:r>
+      <w:proofErr w:type="spellStart"/>
+      <w:r>
+        <w:t>hr</w:t>
+      </w:r>
+      <w:proofErr w:type="spellEnd"/>
+      <w:r>
+        <w:t xml:space="preserve"> and also style the bottom div and the icon and span present in it replace the other 3 </w:t>
+      </w:r>
+      <w:proofErr w:type="spellStart"/>
+      <w:r>
+        <w:t>shareOption</w:t>
+      </w:r>
+      <w:proofErr w:type="spellEnd"/>
+      <w:r>
+        <w:t xml:space="preserve"> icons with </w:t>
+      </w:r>
+      <w:proofErr w:type="spellStart"/>
+      <w:r>
+        <w:t>mui</w:t>
+      </w:r>
+      <w:proofErr w:type="spellEnd"/>
+      <w:r>
+        <w:t xml:space="preserve"> icons of Label, Room and </w:t>
+      </w:r>
+      <w:proofErr w:type="spellStart"/>
+      <w:r>
+        <w:t>EmojiEmotions</w:t>
+      </w:r>
+      <w:proofErr w:type="spellEnd"/>
+      <w:r>
+        <w:t xml:space="preserve"> and then change the colors of icons using internal </w:t>
+      </w:r>
+      <w:proofErr w:type="spellStart"/>
+      <w:r>
+        <w:t>htmlColor</w:t>
+      </w:r>
+      <w:proofErr w:type="spellEnd"/>
+      <w:r>
+        <w:t xml:space="preserve"> attribute and setting to tomato, blue, green, goldenrod</w:t>
       </w:r>
       <w:bookmarkStart w:id="0" w:name="_GoBack"/>
       <w:bookmarkEnd w:id="0"/>
       <w:r>
-        <w:t xml:space="preserve">le files  </w:t>
+        <w:t xml:space="preserve"> </w:t>
+      </w:r>
+      <w:r>
+        <w:t xml:space="preserve"> </w:t>
+      </w:r>
+      <w:r>
+        <w:t xml:space="preserve"> </w:t>
+      </w:r>
+      <w:r>
+        <w:t xml:space="preserve"> </w:t>
+      </w:r>
+      <w:r>
+        <w:t xml:space="preserve"> </w:t>
       </w:r>
     </w:p>
     <w:sectPr>

</xml_diff>

<commit_message>
feed completed and right bar started
</commit_message>
<xml_diff>
--- a/roadmap.docx
+++ b/roadmap.docx
@@ -586,6 +586,282 @@
       <w:r>
         <w:t xml:space="preserve"> attribute and setting to tomato, blue, green, goldenrod</w:t>
       </w:r>
+    </w:p>
+    <w:p>
+      <w:pPr>
+        <w:pStyle w:val="ListParagraph"/>
+        <w:numPr>
+          <w:ilvl w:val="0"/>
+          <w:numId w:val="1"/>
+        </w:numPr>
+      </w:pPr>
+      <w:r>
+        <w:t>Now add a button after the options div namely share and style it</w:t>
+      </w:r>
+      <w:r>
+        <w:t>.</w:t>
+      </w:r>
+    </w:p>
+    <w:p>
+      <w:pPr>
+        <w:pStyle w:val="ListParagraph"/>
+        <w:numPr>
+          <w:ilvl w:val="0"/>
+          <w:numId w:val="1"/>
+        </w:numPr>
+      </w:pPr>
+      <w:r>
+        <w:t>Now the share component is complete now create a post component for the display of all posts</w:t>
+      </w:r>
+    </w:p>
+    <w:p>
+      <w:pPr>
+        <w:pStyle w:val="ListParagraph"/>
+        <w:numPr>
+          <w:ilvl w:val="0"/>
+          <w:numId w:val="1"/>
+        </w:numPr>
+      </w:pPr>
+      <w:r>
+        <w:lastRenderedPageBreak/>
+        <w:t xml:space="preserve">In the post component create a div called post container and in it a div post wrapper and in it 3 </w:t>
+      </w:r>
+      <w:proofErr w:type="spellStart"/>
+      <w:r>
+        <w:t>divs</w:t>
+      </w:r>
+      <w:proofErr w:type="spellEnd"/>
+      <w:r>
+        <w:t xml:space="preserve"> post top, center and bottom</w:t>
+      </w:r>
+    </w:p>
+    <w:p>
+      <w:pPr>
+        <w:pStyle w:val="ListParagraph"/>
+        <w:numPr>
+          <w:ilvl w:val="0"/>
+          <w:numId w:val="1"/>
+        </w:numPr>
+      </w:pPr>
+      <w:r>
+        <w:t xml:space="preserve">Now in </w:t>
+      </w:r>
+      <w:proofErr w:type="spellStart"/>
+      <w:r>
+        <w:t>postTop</w:t>
+      </w:r>
+      <w:proofErr w:type="spellEnd"/>
+      <w:r>
+        <w:t xml:space="preserve"> div there will be 2 </w:t>
+      </w:r>
+      <w:proofErr w:type="spellStart"/>
+      <w:r>
+        <w:t>divs</w:t>
+      </w:r>
+      <w:proofErr w:type="spellEnd"/>
+      <w:r>
+        <w:t xml:space="preserve"> </w:t>
+      </w:r>
+      <w:proofErr w:type="spellStart"/>
+      <w:r>
+        <w:t>topLeft</w:t>
+      </w:r>
+      <w:proofErr w:type="spellEnd"/>
+      <w:r>
+        <w:t xml:space="preserve"> and </w:t>
+      </w:r>
+      <w:proofErr w:type="spellStart"/>
+      <w:r>
+        <w:t>topRight</w:t>
+      </w:r>
+      <w:proofErr w:type="spellEnd"/>
+      <w:r>
+        <w:t xml:space="preserve">. Top left will contain the profile image, username and the posting date. </w:t>
+      </w:r>
+      <w:proofErr w:type="spellStart"/>
+      <w:r>
+        <w:t>Topright</w:t>
+      </w:r>
+      <w:proofErr w:type="spellEnd"/>
+      <w:r>
+        <w:t xml:space="preserve"> will contain the material icon of </w:t>
+      </w:r>
+      <w:proofErr w:type="spellStart"/>
+      <w:r>
+        <w:t>MoreVert</w:t>
+      </w:r>
+      <w:proofErr w:type="spellEnd"/>
+      <w:r>
+        <w:t xml:space="preserve"> and now style the whole </w:t>
+      </w:r>
+      <w:proofErr w:type="spellStart"/>
+      <w:r>
+        <w:t>postTop</w:t>
+      </w:r>
+      <w:proofErr w:type="spellEnd"/>
+      <w:r>
+        <w:t xml:space="preserve"> and its contents, the </w:t>
+      </w:r>
+      <w:proofErr w:type="spellStart"/>
+      <w:r>
+        <w:t>postTop</w:t>
+      </w:r>
+      <w:proofErr w:type="spellEnd"/>
+      <w:r>
+        <w:t xml:space="preserve"> will be completed.</w:t>
+      </w:r>
+    </w:p>
+    <w:p>
+      <w:pPr>
+        <w:pStyle w:val="ListParagraph"/>
+        <w:numPr>
+          <w:ilvl w:val="0"/>
+          <w:numId w:val="1"/>
+        </w:numPr>
+      </w:pPr>
+      <w:r>
+        <w:t xml:space="preserve">Now in </w:t>
+      </w:r>
+      <w:proofErr w:type="spellStart"/>
+      <w:r>
+        <w:t>postCenter</w:t>
+      </w:r>
+      <w:proofErr w:type="spellEnd"/>
+      <w:r>
+        <w:t xml:space="preserve"> it will contain a span namely </w:t>
+      </w:r>
+      <w:proofErr w:type="spellStart"/>
+      <w:r>
+        <w:t>postText</w:t>
+      </w:r>
+      <w:proofErr w:type="spellEnd"/>
+      <w:r>
+        <w:t xml:space="preserve"> and an </w:t>
+      </w:r>
+      <w:proofErr w:type="spellStart"/>
+      <w:r>
+        <w:t>img</w:t>
+      </w:r>
+      <w:proofErr w:type="spellEnd"/>
+      <w:r>
+        <w:t xml:space="preserve"> namely </w:t>
+      </w:r>
+      <w:proofErr w:type="spellStart"/>
+      <w:r>
+        <w:t>postImage</w:t>
+      </w:r>
+      <w:proofErr w:type="spellEnd"/>
+    </w:p>
+    <w:p>
+      <w:pPr>
+        <w:pStyle w:val="ListParagraph"/>
+        <w:numPr>
+          <w:ilvl w:val="0"/>
+          <w:numId w:val="1"/>
+        </w:numPr>
+      </w:pPr>
+      <w:r>
+        <w:t xml:space="preserve">Now in </w:t>
+      </w:r>
+      <w:proofErr w:type="spellStart"/>
+      <w:r>
+        <w:t>postBottom</w:t>
+      </w:r>
+      <w:proofErr w:type="spellEnd"/>
+      <w:r>
+        <w:t xml:space="preserve"> it will be divided into two </w:t>
+      </w:r>
+      <w:proofErr w:type="spellStart"/>
+      <w:r>
+        <w:t>divs</w:t>
+      </w:r>
+      <w:proofErr w:type="spellEnd"/>
+      <w:r>
+        <w:t xml:space="preserve"> </w:t>
+      </w:r>
+      <w:proofErr w:type="spellStart"/>
+      <w:r>
+        <w:t>bottomLeft</w:t>
+      </w:r>
+      <w:proofErr w:type="spellEnd"/>
+      <w:r>
+        <w:t xml:space="preserve"> and </w:t>
+      </w:r>
+      <w:proofErr w:type="spellStart"/>
+      <w:r>
+        <w:t>bottomRight</w:t>
+      </w:r>
+      <w:proofErr w:type="spellEnd"/>
+      <w:r>
+        <w:t xml:space="preserve">. left contains two images which are like.png and heart.png both with the </w:t>
+      </w:r>
+      <w:proofErr w:type="spellStart"/>
+      <w:r>
+        <w:t>classname</w:t>
+      </w:r>
+      <w:proofErr w:type="spellEnd"/>
+      <w:r>
+        <w:t xml:space="preserve"> of </w:t>
+      </w:r>
+      <w:proofErr w:type="spellStart"/>
+      <w:r>
+        <w:t>likeIcon</w:t>
+      </w:r>
+      <w:proofErr w:type="spellEnd"/>
+      <w:r>
+        <w:t xml:space="preserve"> and a span namely </w:t>
+      </w:r>
+      <w:proofErr w:type="spellStart"/>
+      <w:r>
+        <w:t>postLikeCounter</w:t>
+      </w:r>
+      <w:proofErr w:type="spellEnd"/>
+      <w:r>
+        <w:t xml:space="preserve">. Right contains a span namely </w:t>
+      </w:r>
+      <w:proofErr w:type="spellStart"/>
+      <w:r>
+        <w:t>postCommentText</w:t>
+      </w:r>
+      <w:proofErr w:type="spellEnd"/>
+      <w:r>
+        <w:t xml:space="preserve"> containing the number of comments </w:t>
+      </w:r>
+      <w:proofErr w:type="spellStart"/>
+      <w:r>
+        <w:t>eg</w:t>
+      </w:r>
+      <w:proofErr w:type="spellEnd"/>
+      <w:r>
+        <w:t xml:space="preserve"> 9 comments.</w:t>
+      </w:r>
+    </w:p>
+    <w:p>
+      <w:pPr>
+        <w:pStyle w:val="ListParagraph"/>
+        <w:numPr>
+          <w:ilvl w:val="0"/>
+          <w:numId w:val="1"/>
+        </w:numPr>
+      </w:pPr>
+      <w:r>
+        <w:t>Now style the center and bottom wrappers</w:t>
+      </w:r>
+      <w:r>
+        <w:t xml:space="preserve"> and duplicate 6 to 7 more post components in the feed component</w:t>
+      </w:r>
+      <w:r>
+        <w:t>. The feed component is complete</w:t>
+      </w:r>
+    </w:p>
+    <w:p>
+      <w:pPr>
+        <w:pStyle w:val="ListParagraph"/>
+        <w:numPr>
+          <w:ilvl w:val="0"/>
+          <w:numId w:val="1"/>
+        </w:numPr>
+      </w:pPr>
       <w:bookmarkStart w:id="0" w:name="_GoBack"/>
       <w:bookmarkEnd w:id="0"/>
       <w:r>

</xml_diff>

<commit_message>
rightbar completed layout completed
</commit_message>
<xml_diff>
--- a/roadmap.docx
+++ b/roadmap.docx
@@ -862,22 +862,170 @@
           <w:numId w:val="1"/>
         </w:numPr>
       </w:pPr>
+      <w:r>
+        <w:t xml:space="preserve">Now the right bar. It contains a </w:t>
+      </w:r>
+      <w:proofErr w:type="spellStart"/>
+      <w:r>
+        <w:t>rightbar</w:t>
+      </w:r>
+      <w:proofErr w:type="spellEnd"/>
+      <w:r>
+        <w:t xml:space="preserve"> Wrapper div which contains a </w:t>
+      </w:r>
+      <w:proofErr w:type="spellStart"/>
+      <w:r>
+        <w:t>birthdayContainer</w:t>
+      </w:r>
+      <w:proofErr w:type="spellEnd"/>
+      <w:r>
+        <w:t xml:space="preserve"> dev</w:t>
+      </w:r>
+      <w:r>
+        <w:t xml:space="preserve"> </w:t>
+      </w:r>
+      <w:r>
+        <w:t xml:space="preserve">which contains an </w:t>
+      </w:r>
+      <w:proofErr w:type="spellStart"/>
+      <w:r>
+        <w:t>img</w:t>
+      </w:r>
+      <w:proofErr w:type="spellEnd"/>
+      <w:r>
+        <w:t xml:space="preserve"> namely </w:t>
+      </w:r>
+      <w:proofErr w:type="spellStart"/>
+      <w:r>
+        <w:t>birthdayImg</w:t>
+      </w:r>
+      <w:proofErr w:type="spellEnd"/>
+      <w:r>
+        <w:t xml:space="preserve"> which is gift.png</w:t>
+      </w:r>
+      <w:r>
+        <w:t xml:space="preserve"> and a span namely </w:t>
+      </w:r>
+      <w:proofErr w:type="spellStart"/>
+      <w:r>
+        <w:t>birthdayText</w:t>
+      </w:r>
+      <w:proofErr w:type="spellEnd"/>
+      <w:r>
+        <w:t xml:space="preserve"> which contains the line that </w:t>
+      </w:r>
+      <w:proofErr w:type="spellStart"/>
+      <w:r>
+        <w:t>pola</w:t>
+      </w:r>
+      <w:proofErr w:type="spellEnd"/>
+      <w:r>
+        <w:t xml:space="preserve"> </w:t>
+      </w:r>
+      <w:proofErr w:type="spellStart"/>
+      <w:r>
+        <w:t>fostr</w:t>
+      </w:r>
+      <w:proofErr w:type="spellEnd"/>
+      <w:r>
+        <w:t xml:space="preserve"> and 3 others have birthday today</w:t>
+      </w:r>
+      <w:r>
+        <w:t>. Style these tags</w:t>
+      </w:r>
+      <w:r>
+        <w:t>.</w:t>
+      </w:r>
+    </w:p>
+    <w:p>
+      <w:pPr>
+        <w:pStyle w:val="ListParagraph"/>
+        <w:numPr>
+          <w:ilvl w:val="0"/>
+          <w:numId w:val="1"/>
+        </w:numPr>
+      </w:pPr>
+      <w:r>
+        <w:t xml:space="preserve">Now add the ad image after the </w:t>
+      </w:r>
+      <w:proofErr w:type="spellStart"/>
+      <w:r>
+        <w:t>birthdayContainer</w:t>
+      </w:r>
+      <w:proofErr w:type="spellEnd"/>
+      <w:r>
+        <w:t xml:space="preserve"> which is ad.png and style it.</w:t>
+      </w:r>
+    </w:p>
+    <w:p>
+      <w:pPr>
+        <w:pStyle w:val="ListParagraph"/>
+        <w:numPr>
+          <w:ilvl w:val="0"/>
+          <w:numId w:val="1"/>
+        </w:numPr>
+      </w:pPr>
+      <w:r>
+        <w:t>Now add an h4 heading below the image saying online friends.</w:t>
+      </w:r>
+    </w:p>
+    <w:p>
+      <w:pPr>
+        <w:pStyle w:val="ListParagraph"/>
+        <w:numPr>
+          <w:ilvl w:val="0"/>
+          <w:numId w:val="1"/>
+        </w:numPr>
+      </w:pPr>
+      <w:r>
+        <w:t xml:space="preserve">Below h4 add a </w:t>
+      </w:r>
+      <w:proofErr w:type="spellStart"/>
+      <w:r>
+        <w:t>ul</w:t>
+      </w:r>
+      <w:proofErr w:type="spellEnd"/>
+      <w:r>
+        <w:t xml:space="preserve"> containing the list of online friends each li contains a div which contains the user </w:t>
+      </w:r>
+      <w:proofErr w:type="spellStart"/>
+      <w:r>
+        <w:t>img</w:t>
+      </w:r>
+      <w:proofErr w:type="spellEnd"/>
+      <w:r>
+        <w:t xml:space="preserve"> and a span badge that shows online</w:t>
+      </w:r>
+      <w:r>
+        <w:t xml:space="preserve"> and after div a span containing the username</w:t>
+      </w:r>
+      <w:r>
+        <w:t xml:space="preserve">. Style these items so that the </w:t>
+      </w:r>
+      <w:proofErr w:type="spellStart"/>
+      <w:r>
+        <w:t>img</w:t>
+      </w:r>
+      <w:proofErr w:type="spellEnd"/>
+      <w:r>
+        <w:t>, badge and name appear accordingly and then copy the li 6 to 7 times to duplicate the online friends</w:t>
+      </w:r>
+    </w:p>
+    <w:p>
+      <w:pPr>
+        <w:pStyle w:val="ListParagraph"/>
+        <w:numPr>
+          <w:ilvl w:val="0"/>
+          <w:numId w:val="1"/>
+        </w:numPr>
+      </w:pPr>
+      <w:r>
+        <w:t>The front end</w:t>
+      </w:r>
       <w:bookmarkStart w:id="0" w:name="_GoBack"/>
       <w:bookmarkEnd w:id="0"/>
       <w:r>
-        <w:t xml:space="preserve"> </w:t>
-      </w:r>
-      <w:r>
-        <w:t xml:space="preserve"> </w:t>
-      </w:r>
-      <w:r>
-        <w:t xml:space="preserve"> </w:t>
-      </w:r>
-      <w:r>
-        <w:t xml:space="preserve"> </w:t>
-      </w:r>
-      <w:r>
-        <w:t xml:space="preserve"> </w:t>
+        <w:t xml:space="preserve"> layout is completed now</w:t>
       </w:r>
     </w:p>
     <w:sectPr>

</xml_diff>

<commit_message>
posts displayed dynamically from the dummy data file
</commit_message>
<xml_diff>
--- a/roadmap.docx
+++ b/roadmap.docx
@@ -1020,12 +1020,160 @@
         </w:numPr>
       </w:pPr>
       <w:r>
-        <w:t>The front end</w:t>
+        <w:t>The front end layout is completed now</w:t>
+      </w:r>
+      <w:r>
+        <w:t>.</w:t>
+      </w:r>
+    </w:p>
+    <w:p>
+      <w:pPr>
+        <w:pStyle w:val="ListParagraph"/>
+        <w:numPr>
+          <w:ilvl w:val="0"/>
+          <w:numId w:val="1"/>
+        </w:numPr>
+      </w:pPr>
+      <w:r>
+        <w:t xml:space="preserve">Now add the dummydata.js file which contains the </w:t>
+      </w:r>
+      <w:proofErr w:type="gramStart"/>
+      <w:r>
+        <w:t>users</w:t>
+      </w:r>
+      <w:proofErr w:type="gramEnd"/>
+      <w:r>
+        <w:t xml:space="preserve"> data and dummy posts.</w:t>
+      </w:r>
+    </w:p>
+    <w:p>
+      <w:pPr>
+        <w:pStyle w:val="ListParagraph"/>
+        <w:numPr>
+          <w:ilvl w:val="0"/>
+          <w:numId w:val="1"/>
+        </w:numPr>
+      </w:pPr>
+      <w:r>
+        <w:t>Go to the feed component and import the dummy file in it and instead of multiple post components in it use t</w:t>
+      </w:r>
+      <w:r>
+        <w:t>he map method and in that method insert the Post component</w:t>
+      </w:r>
+      <w:r>
+        <w:t xml:space="preserve"> with key as p.id and post as p.</w:t>
+      </w:r>
+    </w:p>
+    <w:p>
+      <w:pPr>
+        <w:pStyle w:val="ListParagraph"/>
+        <w:numPr>
+          <w:ilvl w:val="0"/>
+          <w:numId w:val="1"/>
+        </w:numPr>
+      </w:pPr>
+      <w:r>
+        <w:t xml:space="preserve">Now go to post component and insert post as argument in it and then insert the dynamic data of all post objects </w:t>
+      </w:r>
+      <w:proofErr w:type="spellStart"/>
+      <w:r>
+        <w:t>i.e</w:t>
+      </w:r>
+      <w:proofErr w:type="spellEnd"/>
+      <w:r>
+        <w:t xml:space="preserve"> image, description, date</w:t>
+      </w:r>
+      <w:r>
+        <w:t xml:space="preserve">, like and comments </w:t>
+      </w:r>
+      <w:r>
+        <w:t>instead of hardcode</w:t>
+      </w:r>
+      <w:r>
+        <w:t>.</w:t>
+      </w:r>
+    </w:p>
+    <w:p>
+      <w:pPr>
+        <w:pStyle w:val="ListParagraph"/>
+        <w:numPr>
+          <w:ilvl w:val="0"/>
+          <w:numId w:val="1"/>
+        </w:numPr>
+      </w:pPr>
+      <w:r>
+        <w:t xml:space="preserve">Now for the username and profile pic of the post import Users array from the dummy file in the post component and apply </w:t>
+      </w:r>
+      <w:proofErr w:type="spellStart"/>
+      <w:proofErr w:type="gramStart"/>
+      <w:r>
+        <w:t>user.filter</w:t>
+      </w:r>
+      <w:proofErr w:type="spellEnd"/>
+      <w:proofErr w:type="gramEnd"/>
+      <w:r>
+        <w:t>((u)=&gt;</w:t>
+      </w:r>
+      <w:r>
+        <w:t>u.id===</w:t>
+      </w:r>
+      <w:proofErr w:type="spellStart"/>
+      <w:r>
+        <w:t>post.userId</w:t>
+      </w:r>
+      <w:proofErr w:type="spellEnd"/>
+      <w:r>
+        <w:t>)</w:t>
+      </w:r>
+      <w:r>
+        <w:t>[0].username</w:t>
+      </w:r>
+      <w:r>
+        <w:t xml:space="preserve"> in the username tag and </w:t>
+      </w:r>
+      <w:proofErr w:type="spellStart"/>
+      <w:r>
+        <w:t>Users.filter</w:t>
+      </w:r>
+      <w:proofErr w:type="spellEnd"/>
+      <w:r>
+        <w:t>((u)=&gt;u.id===</w:t>
+      </w:r>
+      <w:proofErr w:type="spellStart"/>
+      <w:r>
+        <w:t>post.userId</w:t>
+      </w:r>
+      <w:proofErr w:type="spellEnd"/>
+      <w:r>
+        <w:t>)[0].</w:t>
+      </w:r>
+      <w:proofErr w:type="spellStart"/>
+      <w:r>
+        <w:t>profilePicture</w:t>
+      </w:r>
+      <w:proofErr w:type="spellEnd"/>
+      <w:r>
+        <w:t xml:space="preserve"> in the profile pic image tag</w:t>
       </w:r>
       <w:bookmarkStart w:id="0" w:name="_GoBack"/>
       <w:bookmarkEnd w:id="0"/>
-      <w:r>
-        <w:t xml:space="preserve"> layout is completed now</w:t>
+    </w:p>
+    <w:p>
+      <w:pPr>
+        <w:pStyle w:val="ListParagraph"/>
+        <w:numPr>
+          <w:ilvl w:val="0"/>
+          <w:numId w:val="1"/>
+        </w:numPr>
+      </w:pPr>
+      <w:r>
+        <w:t xml:space="preserve"> </w:t>
+      </w:r>
+      <w:r>
+        <w:t xml:space="preserve"> </w:t>
+      </w:r>
+      <w:r>
+        <w:t xml:space="preserve"> </w:t>
       </w:r>
     </w:p>
     <w:sectPr>

</xml_diff>

<commit_message>
homepage completed with like dislike functionalities
</commit_message>
<xml_diff>
--- a/roadmap.docx
+++ b/roadmap.docx
@@ -1155,6 +1155,217 @@
       <w:r>
         <w:t xml:space="preserve"> in the profile pic image tag</w:t>
       </w:r>
+    </w:p>
+    <w:p>
+      <w:pPr>
+        <w:pStyle w:val="ListParagraph"/>
+        <w:numPr>
+          <w:ilvl w:val="0"/>
+          <w:numId w:val="1"/>
+        </w:numPr>
+      </w:pPr>
+      <w:r>
+        <w:t>Set the z-index for top bar and position sticky 50px from top for the sidebar</w:t>
+      </w:r>
+    </w:p>
+    <w:p>
+      <w:pPr>
+        <w:pStyle w:val="ListParagraph"/>
+        <w:numPr>
+          <w:ilvl w:val="0"/>
+          <w:numId w:val="1"/>
+        </w:numPr>
+      </w:pPr>
+      <w:r>
+        <w:t xml:space="preserve">Now to make the online friends dynamic go to the </w:t>
+      </w:r>
+      <w:proofErr w:type="spellStart"/>
+      <w:r>
+        <w:t>rightbar</w:t>
+      </w:r>
+      <w:proofErr w:type="spellEnd"/>
+      <w:r>
+        <w:t xml:space="preserve"> component and delete all the extra &lt;li&gt; items and keep only one and now create a new component namely online and paste the whole &lt;li&gt; item in it</w:t>
+      </w:r>
+      <w:r>
+        <w:t xml:space="preserve"> and give it {user} as an argument.</w:t>
+      </w:r>
+    </w:p>
+    <w:p>
+      <w:pPr>
+        <w:pStyle w:val="ListParagraph"/>
+        <w:numPr>
+          <w:ilvl w:val="0"/>
+          <w:numId w:val="1"/>
+        </w:numPr>
+      </w:pPr>
+      <w:r>
+        <w:t xml:space="preserve">Now import the {Users} from the dummy file inside the </w:t>
+      </w:r>
+      <w:proofErr w:type="spellStart"/>
+      <w:r>
+        <w:t>rightBar</w:t>
+      </w:r>
+      <w:proofErr w:type="spellEnd"/>
+      <w:r>
+        <w:t xml:space="preserve"> and apply map method on it and return the Online com</w:t>
+      </w:r>
+      <w:r>
+        <w:t>ponent with user={u} in it.</w:t>
+      </w:r>
+    </w:p>
+    <w:p>
+      <w:pPr>
+        <w:pStyle w:val="ListParagraph"/>
+        <w:numPr>
+          <w:ilvl w:val="0"/>
+          <w:numId w:val="1"/>
+        </w:numPr>
+      </w:pPr>
+      <w:r>
+        <w:t xml:space="preserve">Move the </w:t>
+      </w:r>
+      <w:proofErr w:type="spellStart"/>
+      <w:r>
+        <w:t>css</w:t>
+      </w:r>
+      <w:proofErr w:type="spellEnd"/>
+      <w:r>
+        <w:t xml:space="preserve"> of the &lt;li&gt; item from the </w:t>
+      </w:r>
+      <w:proofErr w:type="spellStart"/>
+      <w:r>
+        <w:t>rightBar</w:t>
+      </w:r>
+      <w:proofErr w:type="spellEnd"/>
+      <w:r>
+        <w:t xml:space="preserve"> to the online.css.</w:t>
+      </w:r>
+    </w:p>
+    <w:p>
+      <w:pPr>
+        <w:pStyle w:val="ListParagraph"/>
+        <w:numPr>
+          <w:ilvl w:val="0"/>
+          <w:numId w:val="1"/>
+        </w:numPr>
+      </w:pPr>
+      <w:r>
+        <w:t>Now doing the same with the sidebar removing the extra friend &lt;li&gt;s and keeping only one</w:t>
+      </w:r>
+      <w:r>
+        <w:t xml:space="preserve"> and again creating a new componen</w:t>
+      </w:r>
+      <w:r>
+        <w:t>t namely friend just like above and paste the whole &lt;li&gt; in it.</w:t>
+      </w:r>
+    </w:p>
+    <w:p>
+      <w:pPr>
+        <w:pStyle w:val="ListParagraph"/>
+        <w:numPr>
+          <w:ilvl w:val="0"/>
+          <w:numId w:val="1"/>
+        </w:numPr>
+      </w:pPr>
+      <w:r>
+        <w:t xml:space="preserve">Now again give {user} as argument to the friend function and set the </w:t>
+      </w:r>
+      <w:proofErr w:type="spellStart"/>
+      <w:r>
+        <w:t>img</w:t>
+      </w:r>
+      <w:proofErr w:type="spellEnd"/>
+      <w:r>
+        <w:t xml:space="preserve"> and name dynamically and import {Users} to the sidebar and apply map method on it just like above</w:t>
+      </w:r>
+      <w:r>
+        <w:t>.</w:t>
+      </w:r>
+    </w:p>
+    <w:p>
+      <w:pPr>
+        <w:pStyle w:val="ListParagraph"/>
+        <w:numPr>
+          <w:ilvl w:val="0"/>
+          <w:numId w:val="1"/>
+        </w:numPr>
+      </w:pPr>
+      <w:r>
+        <w:t>Now add the functionality on like buttons so that the count increase or decrease on clicking them.</w:t>
+      </w:r>
+    </w:p>
+    <w:p>
+      <w:pPr>
+        <w:pStyle w:val="ListParagraph"/>
+        <w:numPr>
+          <w:ilvl w:val="0"/>
+          <w:numId w:val="1"/>
+        </w:numPr>
+      </w:pPr>
+      <w:r>
+        <w:lastRenderedPageBreak/>
+        <w:t xml:space="preserve">To add his functionality just use two </w:t>
+      </w:r>
+      <w:proofErr w:type="spellStart"/>
+      <w:r>
+        <w:t>useStates</w:t>
+      </w:r>
+      <w:proofErr w:type="spellEnd"/>
+      <w:r>
+        <w:t xml:space="preserve"> one for the like count whose initial value is set to the </w:t>
+      </w:r>
+      <w:proofErr w:type="spellStart"/>
+      <w:r>
+        <w:t>post.like</w:t>
+      </w:r>
+      <w:proofErr w:type="spellEnd"/>
+      <w:r>
+        <w:t xml:space="preserve"> and the second which is a Boolean to check if already liked or not and use </w:t>
+      </w:r>
+      <w:proofErr w:type="spellStart"/>
+      <w:r>
+        <w:t>onClick</w:t>
+      </w:r>
+      <w:proofErr w:type="spellEnd"/>
+      <w:r>
+        <w:t xml:space="preserve"> attribute on both like and heart images and give them same function </w:t>
+      </w:r>
+      <w:proofErr w:type="spellStart"/>
+      <w:r>
+        <w:t>handleClick</w:t>
+      </w:r>
+      <w:proofErr w:type="spellEnd"/>
+      <w:r>
+        <w:t xml:space="preserve"> and apply the logic in it that if not liked set the like to like+1 and if liked set it to like-1 and after it set the </w:t>
+      </w:r>
+      <w:proofErr w:type="spellStart"/>
+      <w:r>
+        <w:t>bollean</w:t>
+      </w:r>
+      <w:proofErr w:type="spellEnd"/>
+      <w:r>
+        <w:t xml:space="preserve"> state to the opposite</w:t>
+      </w:r>
+      <w:r>
+        <w:t xml:space="preserve"> and replace the </w:t>
+      </w:r>
+      <w:proofErr w:type="spellStart"/>
+      <w:r>
+        <w:t>post.like</w:t>
+      </w:r>
+      <w:proofErr w:type="spellEnd"/>
+      <w:r>
+        <w:t xml:space="preserve"> with </w:t>
+      </w:r>
+      <w:proofErr w:type="spellStart"/>
+      <w:r>
+        <w:t>likeCount</w:t>
+      </w:r>
+      <w:proofErr w:type="spellEnd"/>
+      <w:r>
+        <w:t xml:space="preserve"> in the span containing the number of people</w:t>
+      </w:r>
       <w:bookmarkStart w:id="0" w:name="_GoBack"/>
       <w:bookmarkEnd w:id="0"/>
     </w:p>
@@ -1166,15 +1377,6 @@
           <w:numId w:val="1"/>
         </w:numPr>
       </w:pPr>
-      <w:r>
-        <w:t xml:space="preserve"> </w:t>
-      </w:r>
-      <w:r>
-        <w:t xml:space="preserve"> </w:t>
-      </w:r>
-      <w:r>
-        <w:t xml:space="preserve"> </w:t>
-      </w:r>
     </w:p>
     <w:sectPr>
       <w:pgSz w:w="12240" w:h="15840"/>

</xml_diff>

<commit_message>
profile page created and coded
</commit_message>
<xml_diff>
--- a/roadmap.docx
+++ b/roadmap.docx
@@ -1,6 +1,6 @@
 
 <file path=word/document.xml><?xml version="1.0" encoding="utf-8"?>
-<w:document xmlns:wpc="http://schemas.microsoft.com/office/word/2010/wordprocessingCanvas" xmlns:cx="http://schemas.microsoft.com/office/drawing/2014/chartex" xmlns:mc="http://schemas.openxmlformats.org/markup-compatibility/2006" xmlns:o="urn:schemas-microsoft-com:office:office" xmlns:r="http://schemas.openxmlformats.org/officeDocument/2006/relationships" xmlns:m="http://schemas.openxmlformats.org/officeDocument/2006/math" xmlns:v="urn:schemas-microsoft-com:vml" xmlns:wp14="http://schemas.microsoft.com/office/word/2010/wordprocessingDrawing" xmlns:wp="http://schemas.openxmlformats.org/drawingml/2006/wordprocessingDrawing" xmlns:w10="urn:schemas-microsoft-com:office:word" xmlns:w="http://schemas.openxmlformats.org/wordprocessingml/2006/main" xmlns:w14="http://schemas.microsoft.com/office/word/2010/wordml" xmlns:w15="http://schemas.microsoft.com/office/word/2012/wordml" xmlns:w16se="http://schemas.microsoft.com/office/word/2015/wordml/symex" xmlns:wpg="http://schemas.microsoft.com/office/word/2010/wordprocessingGroup" xmlns:wpi="http://schemas.microsoft.com/office/word/2010/wordprocessingInk" xmlns:wne="http://schemas.microsoft.com/office/word/2006/wordml" xmlns:wps="http://schemas.microsoft.com/office/word/2010/wordprocessingShape" mc:Ignorable="w14 w15 w16se wp14">
+<w:document xmlns:wpc="http://schemas.microsoft.com/office/word/2010/wordprocessingCanvas" xmlns:cx="http://schemas.microsoft.com/office/drawing/2014/chartex" xmlns:cx1="http://schemas.microsoft.com/office/drawing/2015/9/8/chartex" xmlns:mc="http://schemas.openxmlformats.org/markup-compatibility/2006" xmlns:o="urn:schemas-microsoft-com:office:office" xmlns:r="http://schemas.openxmlformats.org/officeDocument/2006/relationships" xmlns:m="http://schemas.openxmlformats.org/officeDocument/2006/math" xmlns:v="urn:schemas-microsoft-com:vml" xmlns:wp14="http://schemas.microsoft.com/office/word/2010/wordprocessingDrawing" xmlns:wp="http://schemas.openxmlformats.org/drawingml/2006/wordprocessingDrawing" xmlns:w10="urn:schemas-microsoft-com:office:word" xmlns:w="http://schemas.openxmlformats.org/wordprocessingml/2006/main" xmlns:w14="http://schemas.microsoft.com/office/word/2010/wordml" xmlns:w15="http://schemas.microsoft.com/office/word/2012/wordml" xmlns:w16se="http://schemas.microsoft.com/office/word/2015/wordml/symex" xmlns:wpg="http://schemas.microsoft.com/office/word/2010/wordprocessingGroup" xmlns:wpi="http://schemas.microsoft.com/office/word/2010/wordprocessingInk" xmlns:wne="http://schemas.microsoft.com/office/word/2006/wordml" xmlns:wps="http://schemas.microsoft.com/office/word/2010/wordprocessingShape" mc:Ignorable="w14 w15 w16se wp14">
   <w:body>
     <w:p>
       <w:pPr>
@@ -139,15 +139,7 @@
         </w:numPr>
       </w:pPr>
       <w:r>
-        <w:t xml:space="preserve">Now create a </w:t>
-      </w:r>
-      <w:proofErr w:type="gramStart"/>
-      <w:r>
-        <w:t>pages</w:t>
-      </w:r>
-      <w:proofErr w:type="gramEnd"/>
-      <w:r>
-        <w:t xml:space="preserve"> folder inside the </w:t>
+        <w:t xml:space="preserve">Now create a pages folder inside the </w:t>
       </w:r>
       <w:proofErr w:type="spellStart"/>
       <w:r>
@@ -1105,12 +1097,10 @@
         <w:t xml:space="preserve">Now for the username and profile pic of the post import Users array from the dummy file in the post component and apply </w:t>
       </w:r>
       <w:proofErr w:type="spellStart"/>
-      <w:proofErr w:type="gramStart"/>
       <w:r>
         <w:t>user.filter</w:t>
       </w:r>
       <w:proofErr w:type="spellEnd"/>
-      <w:proofErr w:type="gramEnd"/>
       <w:r>
         <w:t>((u)=&gt;</w:t>
       </w:r>
@@ -1366,17 +1356,367 @@
       <w:r>
         <w:t xml:space="preserve"> in the span containing the number of people</w:t>
       </w:r>
+    </w:p>
+    <w:p>
+      <w:pPr>
+        <w:pStyle w:val="ListParagraph"/>
+        <w:numPr>
+          <w:ilvl w:val="0"/>
+          <w:numId w:val="1"/>
+        </w:numPr>
+      </w:pPr>
+      <w:r>
+        <w:t xml:space="preserve">Now the homepage is completed and move on </w:t>
+      </w:r>
+      <w:proofErr w:type="gramStart"/>
+      <w:r>
+        <w:t>to  the</w:t>
+      </w:r>
+      <w:proofErr w:type="gramEnd"/>
+      <w:r>
+        <w:t xml:space="preserve"> profile page for it create a new folder profile in the pages folder and create the respective </w:t>
+      </w:r>
+      <w:proofErr w:type="spellStart"/>
+      <w:r>
+        <w:t>jsx</w:t>
+      </w:r>
+      <w:proofErr w:type="spellEnd"/>
+      <w:r>
+        <w:t xml:space="preserve"> and </w:t>
+      </w:r>
+      <w:proofErr w:type="spellStart"/>
+      <w:r>
+        <w:t>css</w:t>
+      </w:r>
+      <w:proofErr w:type="spellEnd"/>
+      <w:r>
+        <w:t xml:space="preserve"> files</w:t>
+      </w:r>
+      <w:r>
+        <w:t>. Create the profile function and call it in a</w:t>
+      </w:r>
+      <w:r>
+        <w:t>pp.js instead of</w:t>
+      </w:r>
+      <w:r>
+        <w:t xml:space="preserve"> home.js</w:t>
+      </w:r>
+      <w:r>
+        <w:t>.</w:t>
+      </w:r>
+    </w:p>
+    <w:p>
+      <w:pPr>
+        <w:pStyle w:val="ListParagraph"/>
+        <w:numPr>
+          <w:ilvl w:val="0"/>
+          <w:numId w:val="1"/>
+        </w:numPr>
+      </w:pPr>
+      <w:r>
+        <w:t xml:space="preserve">Now import all the components that are present in the </w:t>
+      </w:r>
+      <w:proofErr w:type="spellStart"/>
+      <w:r>
+        <w:t>hompage</w:t>
+      </w:r>
+      <w:proofErr w:type="spellEnd"/>
+      <w:r>
+        <w:t xml:space="preserve"> to the profile page as they will also be used in the profile page</w:t>
+      </w:r>
+      <w:r>
+        <w:t xml:space="preserve"> and change the name of container div to </w:t>
+      </w:r>
+      <w:proofErr w:type="spellStart"/>
+      <w:r>
+        <w:t>profileContainer</w:t>
+      </w:r>
+      <w:proofErr w:type="spellEnd"/>
+    </w:p>
+    <w:p>
+      <w:pPr>
+        <w:pStyle w:val="ListParagraph"/>
+        <w:numPr>
+          <w:ilvl w:val="0"/>
+          <w:numId w:val="1"/>
+        </w:numPr>
+      </w:pPr>
+      <w:r>
+        <w:t xml:space="preserve">Now this page will be in two parts the sidebar in profile container and inside it a </w:t>
+      </w:r>
+      <w:proofErr w:type="spellStart"/>
+      <w:r>
+        <w:t>profileRight</w:t>
+      </w:r>
+      <w:proofErr w:type="spellEnd"/>
+      <w:r>
+        <w:t xml:space="preserve"> container and inside it </w:t>
+      </w:r>
+      <w:proofErr w:type="spellStart"/>
+      <w:r>
+        <w:t>profileRightTop</w:t>
+      </w:r>
+      <w:proofErr w:type="spellEnd"/>
+      <w:r>
+        <w:t xml:space="preserve"> and </w:t>
+      </w:r>
+      <w:proofErr w:type="spellStart"/>
+      <w:r>
+        <w:t>profileRightBottom</w:t>
+      </w:r>
+      <w:proofErr w:type="spellEnd"/>
+      <w:r>
+        <w:t xml:space="preserve"> and feed and </w:t>
+      </w:r>
+      <w:proofErr w:type="spellStart"/>
+      <w:r>
+        <w:t>rightBar</w:t>
+      </w:r>
+      <w:proofErr w:type="spellEnd"/>
+      <w:r>
+        <w:t xml:space="preserve"> will be in bottom</w:t>
+      </w:r>
+      <w:r>
+        <w:t xml:space="preserve"> now style these </w:t>
+      </w:r>
+      <w:proofErr w:type="spellStart"/>
+      <w:r>
+        <w:t>divs</w:t>
+      </w:r>
+      <w:proofErr w:type="spellEnd"/>
+      <w:r>
+        <w:t xml:space="preserve"> such that right div goes to flex 9 and </w:t>
+      </w:r>
+      <w:proofErr w:type="spellStart"/>
+      <w:r>
+        <w:t>rightBottom</w:t>
+      </w:r>
+      <w:proofErr w:type="spellEnd"/>
+      <w:r>
+        <w:t xml:space="preserve"> is set to flex.</w:t>
+      </w:r>
+    </w:p>
+    <w:p>
+      <w:pPr>
+        <w:pStyle w:val="ListParagraph"/>
+        <w:numPr>
+          <w:ilvl w:val="0"/>
+          <w:numId w:val="1"/>
+        </w:numPr>
+      </w:pPr>
+      <w:r>
+        <w:t xml:space="preserve">Now create the top which will be the cover page, profile pic and info create 2 </w:t>
+      </w:r>
+      <w:proofErr w:type="spellStart"/>
+      <w:r>
+        <w:t>divs</w:t>
+      </w:r>
+      <w:proofErr w:type="spellEnd"/>
+      <w:r>
+        <w:t xml:space="preserve"> inside the top on containing the cover and profile images and 2</w:t>
+      </w:r>
+      <w:r>
+        <w:rPr>
+          <w:vertAlign w:val="superscript"/>
+        </w:rPr>
+        <w:t>nd</w:t>
+      </w:r>
+      <w:r>
+        <w:t xml:space="preserve"> containing the profile name and description</w:t>
+      </w:r>
+      <w:r>
+        <w:t>.</w:t>
+      </w:r>
+    </w:p>
+    <w:p>
+      <w:pPr>
+        <w:pStyle w:val="ListParagraph"/>
+        <w:numPr>
+          <w:ilvl w:val="0"/>
+          <w:numId w:val="1"/>
+        </w:numPr>
+      </w:pPr>
+      <w:r>
+        <w:t>Now style thes</w:t>
+      </w:r>
+      <w:r>
+        <w:t xml:space="preserve">e </w:t>
+      </w:r>
+      <w:proofErr w:type="spellStart"/>
+      <w:r>
+        <w:t>divs</w:t>
+      </w:r>
+      <w:proofErr w:type="spellEnd"/>
+      <w:r>
+        <w:t xml:space="preserve"> first the images and then the text as displayed in the page. Increase the font size of username and decrease the font weight of description</w:t>
+      </w:r>
+      <w:r>
+        <w:t>.</w:t>
+      </w:r>
+    </w:p>
+    <w:p>
+      <w:pPr>
+        <w:pStyle w:val="ListParagraph"/>
+        <w:numPr>
+          <w:ilvl w:val="0"/>
+          <w:numId w:val="1"/>
+        </w:numPr>
+      </w:pPr>
+      <w:r>
+        <w:t xml:space="preserve">Now to change the way the </w:t>
+      </w:r>
+      <w:proofErr w:type="spellStart"/>
+      <w:r>
+        <w:t>rightbar</w:t>
+      </w:r>
+      <w:proofErr w:type="spellEnd"/>
+      <w:r>
+        <w:t xml:space="preserve"> appears on the home page and the profile </w:t>
+      </w:r>
+      <w:proofErr w:type="spellStart"/>
+      <w:r>
+        <w:t>pge</w:t>
+      </w:r>
+      <w:proofErr w:type="spellEnd"/>
+      <w:r>
+        <w:t xml:space="preserve"> as it is called in both pages first give a prop profile to the </w:t>
+      </w:r>
+      <w:proofErr w:type="spellStart"/>
+      <w:r>
+        <w:t>rightbar</w:t>
+      </w:r>
+      <w:proofErr w:type="spellEnd"/>
+      <w:r>
+        <w:t xml:space="preserve"> component present in the profile page and also give it as argument in the </w:t>
+      </w:r>
+      <w:proofErr w:type="spellStart"/>
+      <w:r>
+        <w:t>rigthBar</w:t>
+      </w:r>
+      <w:proofErr w:type="spellEnd"/>
+      <w:r>
+        <w:t xml:space="preserve"> component and inside it create two inner components called </w:t>
+      </w:r>
+      <w:proofErr w:type="spellStart"/>
+      <w:r>
+        <w:t>profileRightBar</w:t>
+      </w:r>
+      <w:proofErr w:type="spellEnd"/>
+      <w:r>
+        <w:t xml:space="preserve"> and </w:t>
+      </w:r>
+      <w:proofErr w:type="spellStart"/>
+      <w:r>
+        <w:t>HomeRightBar</w:t>
+      </w:r>
+      <w:proofErr w:type="spellEnd"/>
+      <w:r>
+        <w:t xml:space="preserve">. The home </w:t>
+      </w:r>
+      <w:proofErr w:type="spellStart"/>
+      <w:r>
+        <w:t>rightBar</w:t>
+      </w:r>
+      <w:proofErr w:type="spellEnd"/>
+      <w:r>
+        <w:t xml:space="preserve"> contains the div and </w:t>
+      </w:r>
+      <w:proofErr w:type="spellStart"/>
+      <w:r>
+        <w:t>ul</w:t>
+      </w:r>
+      <w:proofErr w:type="spellEnd"/>
+      <w:r>
+        <w:t xml:space="preserve"> already present in the component just copy paste that code </w:t>
+      </w:r>
+      <w:proofErr w:type="gramStart"/>
+      <w:r>
+        <w:t>In</w:t>
+      </w:r>
+      <w:proofErr w:type="gramEnd"/>
+      <w:r>
+        <w:t xml:space="preserve"> it.</w:t>
+      </w:r>
+    </w:p>
+    <w:p>
+      <w:pPr>
+        <w:pStyle w:val="ListParagraph"/>
+        <w:numPr>
+          <w:ilvl w:val="0"/>
+          <w:numId w:val="1"/>
+        </w:numPr>
+      </w:pPr>
+      <w:r>
+        <w:t xml:space="preserve">Now code the </w:t>
+      </w:r>
+      <w:proofErr w:type="spellStart"/>
+      <w:r>
+        <w:t>profileRightBar</w:t>
+      </w:r>
+      <w:proofErr w:type="spellEnd"/>
+      <w:r>
+        <w:t xml:space="preserve"> in it at the top will be heading of user information, after it a div </w:t>
+      </w:r>
+      <w:proofErr w:type="spellStart"/>
+      <w:r>
+        <w:t>rightBarInfo</w:t>
+      </w:r>
+      <w:proofErr w:type="spellEnd"/>
+      <w:r>
+        <w:t xml:space="preserve"> which contains a div </w:t>
+      </w:r>
+      <w:proofErr w:type="spellStart"/>
+      <w:r>
+        <w:t>rightBarInfoItem</w:t>
+      </w:r>
+      <w:proofErr w:type="spellEnd"/>
+      <w:r>
+        <w:t xml:space="preserve"> which contains </w:t>
+      </w:r>
+      <w:r>
+        <w:t xml:space="preserve">span key value pairs of city, from, relationship and below it a heading of User friends under which a div </w:t>
+      </w:r>
+      <w:proofErr w:type="spellStart"/>
+      <w:r>
+        <w:t>rightBarFollowings</w:t>
+      </w:r>
+      <w:proofErr w:type="spellEnd"/>
+      <w:r>
+        <w:t xml:space="preserve"> and in it a div </w:t>
+      </w:r>
+      <w:proofErr w:type="spellStart"/>
+      <w:r>
+        <w:t>rightBarFollowing</w:t>
+      </w:r>
+      <w:proofErr w:type="spellEnd"/>
+      <w:r>
+        <w:t xml:space="preserve"> which contains a user image and name copy these following </w:t>
+      </w:r>
+      <w:proofErr w:type="spellStart"/>
+      <w:r>
+        <w:t>divs</w:t>
+      </w:r>
+      <w:proofErr w:type="spellEnd"/>
+      <w:r>
+        <w:t xml:space="preserve"> 6 times so that 6 users appear</w:t>
+      </w:r>
+      <w:r>
+        <w:t>.</w:t>
+      </w:r>
+    </w:p>
+    <w:p>
+      <w:pPr>
+        <w:pStyle w:val="ListParagraph"/>
+        <w:numPr>
+          <w:ilvl w:val="0"/>
+          <w:numId w:val="1"/>
+        </w:numPr>
+      </w:pPr>
+      <w:r>
+        <w:t>Now style these new tags in the rightbar.css file</w:t>
+      </w:r>
       <w:bookmarkStart w:id="0" w:name="_GoBack"/>
       <w:bookmarkEnd w:id="0"/>
-    </w:p>
-    <w:p>
-      <w:pPr>
-        <w:pStyle w:val="ListParagraph"/>
-        <w:numPr>
-          <w:ilvl w:val="0"/>
-          <w:numId w:val="1"/>
-        </w:numPr>
-      </w:pPr>
     </w:p>
     <w:sectPr>
       <w:pgSz w:w="12240" w:h="15840"/>
@@ -1389,7 +1729,7 @@
 </file>
 
 <file path=word/numbering.xml><?xml version="1.0" encoding="utf-8"?>
-<w:numbering xmlns:wpc="http://schemas.microsoft.com/office/word/2010/wordprocessingCanvas" xmlns:cx="http://schemas.microsoft.com/office/drawing/2014/chartex" xmlns:mc="http://schemas.openxmlformats.org/markup-compatibility/2006" xmlns:o="urn:schemas-microsoft-com:office:office" xmlns:r="http://schemas.openxmlformats.org/officeDocument/2006/relationships" xmlns:m="http://schemas.openxmlformats.org/officeDocument/2006/math" xmlns:v="urn:schemas-microsoft-com:vml" xmlns:wp14="http://schemas.microsoft.com/office/word/2010/wordprocessingDrawing" xmlns:wp="http://schemas.openxmlformats.org/drawingml/2006/wordprocessingDrawing" xmlns:w10="urn:schemas-microsoft-com:office:word" xmlns:w="http://schemas.openxmlformats.org/wordprocessingml/2006/main" xmlns:w14="http://schemas.microsoft.com/office/word/2010/wordml" xmlns:w15="http://schemas.microsoft.com/office/word/2012/wordml" xmlns:w16se="http://schemas.microsoft.com/office/word/2015/wordml/symex" xmlns:wpg="http://schemas.microsoft.com/office/word/2010/wordprocessingGroup" xmlns:wpi="http://schemas.microsoft.com/office/word/2010/wordprocessingInk" xmlns:wne="http://schemas.microsoft.com/office/word/2006/wordml" xmlns:wps="http://schemas.microsoft.com/office/word/2010/wordprocessingShape" mc:Ignorable="w14 w15 w16se wp14">
+<w:numbering xmlns:wpc="http://schemas.microsoft.com/office/word/2010/wordprocessingCanvas" xmlns:cx="http://schemas.microsoft.com/office/drawing/2014/chartex" xmlns:cx1="http://schemas.microsoft.com/office/drawing/2015/9/8/chartex" xmlns:mc="http://schemas.openxmlformats.org/markup-compatibility/2006" xmlns:o="urn:schemas-microsoft-com:office:office" xmlns:r="http://schemas.openxmlformats.org/officeDocument/2006/relationships" xmlns:m="http://schemas.openxmlformats.org/officeDocument/2006/math" xmlns:v="urn:schemas-microsoft-com:vml" xmlns:wp14="http://schemas.microsoft.com/office/word/2010/wordprocessingDrawing" xmlns:wp="http://schemas.openxmlformats.org/drawingml/2006/wordprocessingDrawing" xmlns:w10="urn:schemas-microsoft-com:office:word" xmlns:w="http://schemas.openxmlformats.org/wordprocessingml/2006/main" xmlns:w14="http://schemas.microsoft.com/office/word/2010/wordml" xmlns:w15="http://schemas.microsoft.com/office/word/2012/wordml" xmlns:w16se="http://schemas.microsoft.com/office/word/2015/wordml/symex" xmlns:wpg="http://schemas.microsoft.com/office/word/2010/wordprocessingGroup" xmlns:wpi="http://schemas.microsoft.com/office/word/2010/wordprocessingInk" xmlns:wne="http://schemas.microsoft.com/office/word/2006/wordml" xmlns:wps="http://schemas.microsoft.com/office/word/2010/wordprocessingShape" mc:Ignorable="w14 w15 w16se wp14">
   <w:abstractNum w:abstractNumId="0" w15:restartNumberingAfterBreak="0">
     <w:nsid w:val="4D823403"/>
     <w:multiLevelType w:val="hybridMultilevel"/>

</xml_diff>

<commit_message>
rightbar on profile page, login page and register page completed
</commit_message>
<xml_diff>
--- a/roadmap.docx
+++ b/roadmap.docx
@@ -1715,8 +1715,263 @@
       <w:r>
         <w:t>Now style these new tags in the rightbar.css file</w:t>
       </w:r>
+      <w:r>
+        <w:t xml:space="preserve"> and the profile page is completed.</w:t>
+      </w:r>
+    </w:p>
+    <w:p>
+      <w:pPr>
+        <w:pStyle w:val="ListParagraph"/>
+        <w:numPr>
+          <w:ilvl w:val="0"/>
+          <w:numId w:val="1"/>
+        </w:numPr>
+      </w:pPr>
+      <w:r>
+        <w:t>Now we will create the login/register page</w:t>
+      </w:r>
+    </w:p>
+    <w:p>
+      <w:pPr>
+        <w:pStyle w:val="ListParagraph"/>
+        <w:numPr>
+          <w:ilvl w:val="0"/>
+          <w:numId w:val="1"/>
+        </w:numPr>
+      </w:pPr>
+      <w:r>
+        <w:t xml:space="preserve">For it create a new </w:t>
+      </w:r>
+      <w:proofErr w:type="gramStart"/>
+      <w:r>
+        <w:t>page(</w:t>
+      </w:r>
+      <w:proofErr w:type="gramEnd"/>
+      <w:r>
+        <w:t>folder) namely login in the pages folder and its respective files</w:t>
+      </w:r>
+      <w:r>
+        <w:t xml:space="preserve"> and the function.</w:t>
+      </w:r>
+    </w:p>
+    <w:p>
+      <w:pPr>
+        <w:pStyle w:val="ListParagraph"/>
+        <w:numPr>
+          <w:ilvl w:val="0"/>
+          <w:numId w:val="1"/>
+        </w:numPr>
+      </w:pPr>
+      <w:r>
+        <w:t xml:space="preserve">The login page will contain a div </w:t>
+      </w:r>
+      <w:proofErr w:type="spellStart"/>
+      <w:r>
+        <w:t>loginPageCntnr</w:t>
+      </w:r>
+      <w:proofErr w:type="spellEnd"/>
+      <w:r>
+        <w:t xml:space="preserve"> and inside it a div </w:t>
+      </w:r>
+      <w:proofErr w:type="spellStart"/>
+      <w:r>
+        <w:t>loginWrapper</w:t>
+      </w:r>
+      <w:proofErr w:type="spellEnd"/>
+      <w:r>
+        <w:t xml:space="preserve"> and inside it two </w:t>
+      </w:r>
+      <w:proofErr w:type="spellStart"/>
+      <w:r>
+        <w:t>divs</w:t>
+      </w:r>
+      <w:proofErr w:type="spellEnd"/>
+      <w:r>
+        <w:t xml:space="preserve"> </w:t>
+      </w:r>
+      <w:proofErr w:type="spellStart"/>
+      <w:r>
+        <w:t>rightWrapper</w:t>
+      </w:r>
+      <w:proofErr w:type="spellEnd"/>
+      <w:r>
+        <w:t xml:space="preserve"> and </w:t>
+      </w:r>
+      <w:proofErr w:type="spellStart"/>
+      <w:r>
+        <w:t>leftWrapper</w:t>
+      </w:r>
+      <w:proofErr w:type="spellEnd"/>
+      <w:r>
+        <w:t xml:space="preserve">. The </w:t>
+      </w:r>
+      <w:proofErr w:type="spellStart"/>
+      <w:r>
+        <w:t>leftWrapper</w:t>
+      </w:r>
+      <w:proofErr w:type="spellEnd"/>
+      <w:r>
+        <w:t xml:space="preserve"> will contain </w:t>
+      </w:r>
+      <w:proofErr w:type="gramStart"/>
+      <w:r>
+        <w:t>a</w:t>
+      </w:r>
+      <w:proofErr w:type="gramEnd"/>
+      <w:r>
+        <w:t xml:space="preserve"> h3 namely </w:t>
+      </w:r>
+      <w:proofErr w:type="spellStart"/>
+      <w:r>
+        <w:t>loginLogo</w:t>
+      </w:r>
+      <w:proofErr w:type="spellEnd"/>
+      <w:r>
+        <w:t xml:space="preserve"> containing the logo name of app and below it a span containing the description. The </w:t>
+      </w:r>
+      <w:proofErr w:type="spellStart"/>
+      <w:r>
+        <w:t>rightWrapper</w:t>
+      </w:r>
+      <w:proofErr w:type="spellEnd"/>
+      <w:r>
+        <w:t xml:space="preserve"> will contain a div namely </w:t>
+      </w:r>
+      <w:proofErr w:type="spellStart"/>
+      <w:r>
+        <w:t>loginFieldsCntnr</w:t>
+      </w:r>
+      <w:proofErr w:type="spellEnd"/>
+      <w:r>
+        <w:t>. Now first call it in the app.js</w:t>
+      </w:r>
+      <w:r>
+        <w:t xml:space="preserve">. </w:t>
+      </w:r>
+      <w:proofErr w:type="gramStart"/>
+      <w:r>
+        <w:t>the</w:t>
+      </w:r>
+      <w:proofErr w:type="gramEnd"/>
+      <w:r>
+        <w:t xml:space="preserve"> </w:t>
+      </w:r>
+      <w:proofErr w:type="spellStart"/>
+      <w:r>
+        <w:t>loginFieldsCntnr</w:t>
+      </w:r>
+      <w:proofErr w:type="spellEnd"/>
+      <w:r>
+        <w:t xml:space="preserve"> will contain two inputs for email and password and a button saying login and below it a span saying forgot Password? And below it another button saying create an account</w:t>
+      </w:r>
+      <w:r>
+        <w:t>.</w:t>
+      </w:r>
+    </w:p>
+    <w:p>
+      <w:pPr>
+        <w:pStyle w:val="ListParagraph"/>
+        <w:numPr>
+          <w:ilvl w:val="0"/>
+          <w:numId w:val="1"/>
+        </w:numPr>
+      </w:pPr>
+      <w:r>
+        <w:t>Now style all these elements according to the display.</w:t>
+      </w:r>
+    </w:p>
+    <w:p>
+      <w:pPr>
+        <w:pStyle w:val="ListParagraph"/>
+        <w:numPr>
+          <w:ilvl w:val="0"/>
+          <w:numId w:val="1"/>
+        </w:numPr>
+      </w:pPr>
+      <w:r>
+        <w:t>Now we will create register page</w:t>
+      </w:r>
+    </w:p>
+    <w:p>
+      <w:pPr>
+        <w:pStyle w:val="ListParagraph"/>
+        <w:numPr>
+          <w:ilvl w:val="0"/>
+          <w:numId w:val="1"/>
+        </w:numPr>
+      </w:pPr>
+      <w:r>
+        <w:t>It will be almost same as the lo</w:t>
+      </w:r>
+      <w:r>
+        <w:t>gin page so copy the login page and rename the folder and files to register.</w:t>
+      </w:r>
+    </w:p>
+    <w:p>
+      <w:pPr>
+        <w:pStyle w:val="ListParagraph"/>
+        <w:numPr>
+          <w:ilvl w:val="0"/>
+          <w:numId w:val="1"/>
+        </w:numPr>
+      </w:pPr>
+      <w:r>
+        <w:lastRenderedPageBreak/>
+        <w:t>Just change the name of function and buttons to Sign Up and Log into your account</w:t>
+      </w:r>
+      <w:r>
+        <w:t xml:space="preserve"> and remove </w:t>
+      </w:r>
+      <w:proofErr w:type="gramStart"/>
+      <w:r>
+        <w:t>the forgot</w:t>
+      </w:r>
+      <w:proofErr w:type="gramEnd"/>
+      <w:r>
+        <w:t xml:space="preserve"> password span</w:t>
+      </w:r>
+      <w:r>
+        <w:t xml:space="preserve"> and add 2 more inputs of username and confirm password</w:t>
+      </w:r>
+      <w:r>
+        <w:t>. The register page is complete</w:t>
+      </w:r>
+    </w:p>
+    <w:p>
+      <w:pPr>
+        <w:pStyle w:val="ListParagraph"/>
+        <w:numPr>
+          <w:ilvl w:val="0"/>
+          <w:numId w:val="1"/>
+        </w:numPr>
+      </w:pPr>
+      <w:r>
+        <w:t xml:space="preserve">Now go to the </w:t>
+      </w:r>
+      <w:proofErr w:type="spellStart"/>
+      <w:r>
+        <w:t>rightbar.jsx</w:t>
+      </w:r>
+      <w:proofErr w:type="spellEnd"/>
+      <w:r>
+        <w:t xml:space="preserve"> and in the return add the logic that {</w:t>
+      </w:r>
+      <w:proofErr w:type="gramStart"/>
+      <w:r>
+        <w:t>profile ?</w:t>
+      </w:r>
+      <w:proofErr w:type="gramEnd"/>
+      <w:r>
+        <w:t xml:space="preserve"> &lt;profileRightBar/&gt;:&lt;homeightbar</w:t>
+      </w:r>
       <w:bookmarkStart w:id="0" w:name="_GoBack"/>
       <w:bookmarkEnd w:id="0"/>
+      <w:r>
+        <w:t>&gt;}</w:t>
+      </w:r>
+      <w:r>
+        <w:t xml:space="preserve"> </w:t>
+      </w:r>
     </w:p>
     <w:sectPr>
       <w:pgSz w:w="12240" w:h="15840"/>

</xml_diff>